<commit_message>
docs: adiciona links dos vídeos de pitch e apresentação
</commit_message>
<xml_diff>
--- a/docs/CP4_Respira+_Documentacao.docx
+++ b/docs/CP4_Respira+_Documentacao.docx
@@ -1704,7 +1704,68 @@
         <w:spacing w:after="200" w:before="400"/>
       </w:pPr>
       <w:r>
-        <w:t xml:space="preserve">10. Próximos passos (CP5 e CP6)</w:t>
+        <w:t xml:space="preserve">10. Vídeos do projeto</w:t>
+      </w:r>
+    </w:p>
+    <w:p>
+      <w:pPr>
+        <w:spacing w:after="160"/>
+      </w:pPr>
+      <w:r>
+        <w:t xml:space="preserve">Os dois vídeos exigidos neste checkpoint estão publicados no YouTube:</w:t>
+      </w:r>
+    </w:p>
+    <w:p>
+      <w:pPr>
+        <w:pStyle w:val="Heading2"/>
+        <w:spacing w:after="150" w:before="300"/>
+      </w:pPr>
+      <w:r>
+        <w:t xml:space="preserve">10.1 Pitch de venda (1 minuto)</w:t>
+      </w:r>
+    </w:p>
+    <w:p>
+      <w:pPr>
+        <w:spacing w:after="160"/>
+      </w:pPr>
+      <w:hyperlink w:history="1" r:id="rId13">
+        <w:r>
+          <w:rPr>
+            <w:rStyle w:val="Hyperlink"/>
+          </w:rPr>
+          <w:t xml:space="preserve">Vídeo do pitch de venda — YouTube</w:t>
+        </w:r>
+      </w:hyperlink>
+    </w:p>
+    <w:p>
+      <w:pPr>
+        <w:pStyle w:val="Heading2"/>
+        <w:spacing w:after="150" w:before="300"/>
+      </w:pPr>
+      <w:r>
+        <w:t xml:space="preserve">10.2 Apresentação do projeto (2 minutos)</w:t>
+      </w:r>
+    </w:p>
+    <w:p>
+      <w:pPr>
+        <w:spacing w:after="160"/>
+      </w:pPr>
+      <w:hyperlink w:history="1" r:id="rId14">
+        <w:r>
+          <w:rPr>
+            <w:rStyle w:val="Hyperlink"/>
+          </w:rPr>
+          <w:t xml:space="preserve">Vídeo de apresentação do projeto — YouTube</w:t>
+        </w:r>
+      </w:hyperlink>
+    </w:p>
+    <w:p>
+      <w:pPr>
+        <w:pStyle w:val="Heading1"/>
+        <w:spacing w:after="200" w:before="400"/>
+      </w:pPr>
+      <w:r>
+        <w:t>11. Próximos passos (CP5 e CP6)</w:t>
       </w:r>
     </w:p>
     <w:p>

</xml_diff>